<commit_message>
Fix S19/S27c: embed full medication-instruction dialogue into speaking shots
</commit_message>
<xml_diff>
--- a/Veo3_プロンプト_肩越し_真正面寄り.docx
+++ b/Veo3_プロンプト_肩越し_真正面寄り.docx
@@ -966,6 +966,34 @@
         <w:t xml:space="preserve">医師が話すショットは『キーフレーム①（患者の肩越し）』、患者が話すショットは『キーフレーム②（医師の肩越し）』を first frame に入れてから、黄色枠下のプロンプトを貼る。手前の相手は必ずキーフレームに合成済み＝Veoに新規で描かせない。</w:t>
       </w:r>
     </w:p>
+    <w:p>
+      <w:pPr>
+        <w:spacing w:after="100" w:line="316"/>
+      </w:pPr>
+      <w:r>
+        <w:rPr>
+          <w:rFonts w:ascii="Yu Gothic" w:cs="Yu Gothic" w:eastAsia="Yu Gothic" w:hAnsi="Yu Gothic"/>
+          <w:b/>
+          <w:bCs/>
+          <w:sz w:val="21"/>
+          <w:szCs w:val="21"/>
+        </w:rPr>
+        <w:t xml:space="preserve">服薬指導（原文の長い1段落）は S19a→S19b→S19c→S19d の4クリップに分割し、全文をもれなく反映済み（S19b『お茶・コーヒーと一緒に飲まない…』、S19c『便が黒くなる…便秘…』も医師が実際に話す形にしました）。</w:t>
+      </w:r>
+    </w:p>
+    <w:p>
+      <w:pPr>
+        <w:spacing w:after="100" w:line="316"/>
+      </w:pPr>
+      <w:r>
+        <w:rPr>
+          <w:rFonts w:ascii="Yu Gothic" w:cs="Yu Gothic" w:eastAsia="Yu Gothic" w:hAnsi="Yu Gothic"/>
+          <w:sz w:val="19"/>
+          <w:szCs w:val="19"/>
+        </w:rPr>
+        <w:t xml:space="preserve">視覚資料は編集で重ねる：S19b（お薬スケジュール表：朝=太陽／夜=月）と S27c（ハンドアウトの赤い危険徴候欄）は、該当クリップの上にワイプ／カットインで画像を重ねると分かりやすくなります（動画自体は医師の発話ショットのままでOK）。</w:t>
+      </w:r>
+    </w:p>
     <w:tbl>
       <w:tblPr>
         <w:tblW w:type="dxa" w:w="9360"/>
@@ -6396,7 +6424,7 @@
                 <w:sz w:val="22"/>
                 <w:szCs w:val="22"/>
               </w:rPr>
-              <w:t xml:space="preserve">S19b · Doctor(VO) · 7s</w:t>
+              <w:t xml:space="preserve">S19b · Doctor · 7s</w:t>
             </w:r>
           </w:p>
         </w:tc>
@@ -6430,7 +6458,7 @@
                 <w:sz w:val="20"/>
                 <w:szCs w:val="20"/>
               </w:rPr>
-              <w:t xml:space="preserve">最初のフレームに使うキーフレーム：Insert（お薬表）</w:t>
+              <w:t xml:space="preserve">最初のフレームに使うキーフレーム：キーフレーム① 患者の肩越し（医師=真正面寄り）</w:t>
             </w:r>
           </w:p>
         </w:tc>
@@ -6499,59 +6527,98 @@
                 <w:sz w:val="19"/>
                 <w:szCs w:val="19"/>
               </w:rPr>
-              <w:t xml:space="preserve">IMAGE-TO-VIDEO. Use the attached insert keyframe (desk/handout) as the first frame. Over-the-shoulder insert of a printed medication schedule: a SUN icon (morning) and a MOON icon (evening) with one pill icon under each. A single female hand with a pen points to the SUN icon.</w:t>
-            </w:r>
-          </w:p>
-          <w:p>
-            <w:pPr>
-              <w:spacing w:after="0"/>
-            </w:pPr>
-            <w:r>
-              <w:rPr>
-                <w:rFonts w:ascii="Consolas" w:cs="Consolas" w:eastAsia="Consolas" w:hAnsi="Consolas"/>
-                <w:sz w:val="19"/>
-                <w:szCs w:val="19"/>
-              </w:rPr>
-              <w:t xml:space="preserve"/>
-            </w:r>
-          </w:p>
-          <w:p>
-            <w:pPr>
-              <w:spacing w:after="0"/>
-            </w:pPr>
-            <w:r>
-              <w:rPr>
-                <w:rFonts w:ascii="Consolas" w:cs="Consolas" w:eastAsia="Consolas" w:hAnsi="Consolas"/>
-                <w:sz w:val="19"/>
-                <w:szCs w:val="19"/>
-              </w:rPr>
-              <w:t xml:space="preserve">Only a single hand may enter the frame — no face, no full person, no second person. Shallow focus, soft daylight, photorealistic, 24fps. No spoken dialogue on screen; quiet room tone only (voice-over added in editing).</w:t>
-            </w:r>
-          </w:p>
-          <w:p>
-            <w:pPr>
-              <w:spacing w:after="0"/>
-            </w:pPr>
-            <w:r>
-              <w:rPr>
-                <w:rFonts w:ascii="Consolas" w:cs="Consolas" w:eastAsia="Consolas" w:hAnsi="Consolas"/>
-                <w:sz w:val="19"/>
-                <w:szCs w:val="19"/>
-              </w:rPr>
-              <w:t xml:space="preserve"/>
-            </w:r>
-          </w:p>
-          <w:p>
-            <w:pPr>
-              <w:spacing w:after="0"/>
-            </w:pPr>
-            <w:r>
-              <w:rPr>
-                <w:rFonts w:ascii="Consolas" w:cs="Consolas" w:eastAsia="Consolas" w:hAnsi="Consolas"/>
-                <w:sz w:val="19"/>
-                <w:szCs w:val="19"/>
-              </w:rPr>
-              <w:t xml:space="preserve">Negative: full person, second person, back of head, over-the-shoulder, subtitles, captions, on-screen text, watermark, logo.</w:t>
+              <w:t xml:space="preserve">IMAGE-TO-VIDEO. Use the attached OVER-THE-SHOULDER keyframe (the Japanese female doctor facing almost frontally toward camera, sharp focus; a SOFT out-of-focus sliver of the patient's shoulder and back-of-head in the lower-RIGHT foreground) as the exact first frame. Animate ONLY the doctor speaking; keep the composition identical. The soft foreground patient stays exactly as in the frame — do not sharpen him, do not turn him toward camera, do not change either face, do not add any third person.</w:t>
+            </w:r>
+          </w:p>
+          <w:p>
+            <w:pPr>
+              <w:spacing w:after="0"/>
+            </w:pPr>
+            <w:r>
+              <w:rPr>
+                <w:rFonts w:ascii="Consolas" w:cs="Consolas" w:eastAsia="Consolas" w:hAnsi="Consolas"/>
+                <w:sz w:val="19"/>
+                <w:szCs w:val="19"/>
+              </w:rPr>
+              <w:t xml:space="preserve"/>
+            </w:r>
+          </w:p>
+          <w:p>
+            <w:pPr>
+              <w:spacing w:after="0"/>
+            </w:pPr>
+            <w:r>
+              <w:rPr>
+                <w:rFonts w:ascii="Consolas" w:cs="Consolas" w:eastAsia="Consolas" w:hAnsi="Consolas"/>
+                <w:sz w:val="19"/>
+                <w:szCs w:val="19"/>
+              </w:rPr>
+              <w:t xml:space="preserve">She says, in clear calm English:</w:t>
+            </w:r>
+          </w:p>
+          <w:p>
+            <w:pPr>
+              <w:spacing w:after="0"/>
+            </w:pPr>
+            <w:r>
+              <w:rPr>
+                <w:rFonts w:ascii="Consolas" w:cs="Consolas" w:eastAsia="Consolas" w:hAnsi="Consolas"/>
+                <w:sz w:val="19"/>
+                <w:szCs w:val="19"/>
+              </w:rPr>
+              <w:t xml:space="preserve">"Do not take it with tea or coffee; they can block iron absorption. Water or juice is fine."</w:t>
+            </w:r>
+          </w:p>
+          <w:p>
+            <w:pPr>
+              <w:spacing w:after="0"/>
+            </w:pPr>
+            <w:r>
+              <w:rPr>
+                <w:rFonts w:ascii="Consolas" w:cs="Consolas" w:eastAsia="Consolas" w:hAnsi="Consolas"/>
+                <w:sz w:val="19"/>
+                <w:szCs w:val="19"/>
+              </w:rPr>
+              <w:t xml:space="preserve"/>
+            </w:r>
+          </w:p>
+          <w:p>
+            <w:pPr>
+              <w:spacing w:after="0"/>
+            </w:pPr>
+            <w:r>
+              <w:rPr>
+                <w:rFonts w:ascii="Consolas" w:cs="Consolas" w:eastAsia="Consolas" w:hAnsi="Consolas"/>
+                <w:sz w:val="19"/>
+                <w:szCs w:val="19"/>
+              </w:rPr>
+              <w:t xml:space="preserve">Motion/direction: calm and clear, gesturing toward the printed medication schedule on the desk. Static eye-level camera, shallow depth of field, soft natural daylight, photorealistic, 24fps.</w:t>
+            </w:r>
+          </w:p>
+          <w:p>
+            <w:pPr>
+              <w:spacing w:after="0"/>
+            </w:pPr>
+            <w:r>
+              <w:rPr>
+                <w:rFonts w:ascii="Consolas" w:cs="Consolas" w:eastAsia="Consolas" w:hAnsi="Consolas"/>
+                <w:sz w:val="19"/>
+                <w:szCs w:val="19"/>
+              </w:rPr>
+              <w:t xml:space="preserve"/>
+            </w:r>
+          </w:p>
+          <w:p>
+            <w:pPr>
+              <w:spacing w:after="0"/>
+            </w:pPr>
+            <w:r>
+              <w:rPr>
+                <w:rFonts w:ascii="Consolas" w:cs="Consolas" w:eastAsia="Consolas" w:hAnsi="Consolas"/>
+                <w:sz w:val="19"/>
+                <w:szCs w:val="19"/>
+              </w:rPr>
+              <w:t xml:space="preserve">Negative: third person, extra person, background person, the soft foreground person turning to face camera or becoming sharp, character substitution, face swap, changed hair or clothing, subtitles, captions, on-screen text, watermark, logo.</w:t>
             </w:r>
           </w:p>
         </w:tc>
@@ -9432,7 +9499,7 @@
                 <w:sz w:val="22"/>
                 <w:szCs w:val="22"/>
               </w:rPr>
-              <w:t xml:space="preserve">S27c · Doctor(VO) · 3s</w:t>
+              <w:t xml:space="preserve">S27c · Doctor · 3s</w:t>
             </w:r>
           </w:p>
         </w:tc>
@@ -9466,7 +9533,7 @@
                 <w:sz w:val="20"/>
                 <w:szCs w:val="20"/>
               </w:rPr>
-              <w:t xml:space="preserve">最初のフレームに使うキーフレーム：Insert（ハンドアウト）</w:t>
+              <w:t xml:space="preserve">最初のフレームに使うキーフレーム：キーフレーム① 患者の肩越し（医師=真正面寄り）</w:t>
             </w:r>
           </w:p>
         </w:tc>
@@ -9535,59 +9602,98 @@
                 <w:sz w:val="19"/>
                 <w:szCs w:val="19"/>
               </w:rPr>
-              <w:t xml:space="preserve">IMAGE-TO-VIDEO. Use the attached insert keyframe (desk/handout) as the first frame. Over-the-shoulder insert of a patient handout with a red-bordered box labeled 'Danger signs'. A single female hand with a pen circles that red box.</w:t>
-            </w:r>
-          </w:p>
-          <w:p>
-            <w:pPr>
-              <w:spacing w:after="0"/>
-            </w:pPr>
-            <w:r>
-              <w:rPr>
-                <w:rFonts w:ascii="Consolas" w:cs="Consolas" w:eastAsia="Consolas" w:hAnsi="Consolas"/>
-                <w:sz w:val="19"/>
-                <w:szCs w:val="19"/>
-              </w:rPr>
-              <w:t xml:space="preserve"/>
-            </w:r>
-          </w:p>
-          <w:p>
-            <w:pPr>
-              <w:spacing w:after="0"/>
-            </w:pPr>
-            <w:r>
-              <w:rPr>
-                <w:rFonts w:ascii="Consolas" w:cs="Consolas" w:eastAsia="Consolas" w:hAnsi="Consolas"/>
-                <w:sz w:val="19"/>
-                <w:szCs w:val="19"/>
-              </w:rPr>
-              <w:t xml:space="preserve">Only a single hand may enter the frame — no face, no full person, no second person. Shallow focus, soft daylight, photorealistic, 24fps. No spoken dialogue on screen; quiet room tone only (voice-over added in editing).</w:t>
-            </w:r>
-          </w:p>
-          <w:p>
-            <w:pPr>
-              <w:spacing w:after="0"/>
-            </w:pPr>
-            <w:r>
-              <w:rPr>
-                <w:rFonts w:ascii="Consolas" w:cs="Consolas" w:eastAsia="Consolas" w:hAnsi="Consolas"/>
-                <w:sz w:val="19"/>
-                <w:szCs w:val="19"/>
-              </w:rPr>
-              <w:t xml:space="preserve"/>
-            </w:r>
-          </w:p>
-          <w:p>
-            <w:pPr>
-              <w:spacing w:after="0"/>
-            </w:pPr>
-            <w:r>
-              <w:rPr>
-                <w:rFonts w:ascii="Consolas" w:cs="Consolas" w:eastAsia="Consolas" w:hAnsi="Consolas"/>
-                <w:sz w:val="19"/>
-                <w:szCs w:val="19"/>
-              </w:rPr>
-              <w:t xml:space="preserve">Negative: full person, second person, back of head, over-the-shoulder, subtitles, captions, on-screen text, watermark, logo.</w:t>
+              <w:t xml:space="preserve">IMAGE-TO-VIDEO. Use the attached OVER-THE-SHOULDER keyframe (the Japanese female doctor facing almost frontally toward camera, sharp focus; a SOFT out-of-focus sliver of the patient's shoulder and back-of-head in the lower-RIGHT foreground) as the exact first frame. Animate ONLY the doctor speaking; keep the composition identical. The soft foreground patient stays exactly as in the frame — do not sharpen him, do not turn him toward camera, do not change either face, do not add any third person.</w:t>
+            </w:r>
+          </w:p>
+          <w:p>
+            <w:pPr>
+              <w:spacing w:after="0"/>
+            </w:pPr>
+            <w:r>
+              <w:rPr>
+                <w:rFonts w:ascii="Consolas" w:cs="Consolas" w:eastAsia="Consolas" w:hAnsi="Consolas"/>
+                <w:sz w:val="19"/>
+                <w:szCs w:val="19"/>
+              </w:rPr>
+              <w:t xml:space="preserve"/>
+            </w:r>
+          </w:p>
+          <w:p>
+            <w:pPr>
+              <w:spacing w:after="0"/>
+            </w:pPr>
+            <w:r>
+              <w:rPr>
+                <w:rFonts w:ascii="Consolas" w:cs="Consolas" w:eastAsia="Consolas" w:hAnsi="Consolas"/>
+                <w:sz w:val="19"/>
+                <w:szCs w:val="19"/>
+              </w:rPr>
+              <w:t xml:space="preserve">She says, in clear calm English:</w:t>
+            </w:r>
+          </w:p>
+          <w:p>
+            <w:pPr>
+              <w:spacing w:after="0"/>
+            </w:pPr>
+            <w:r>
+              <w:rPr>
+                <w:rFonts w:ascii="Consolas" w:cs="Consolas" w:eastAsia="Consolas" w:hAnsi="Consolas"/>
+                <w:sz w:val="19"/>
+                <w:szCs w:val="19"/>
+              </w:rPr>
+              <w:t xml:space="preserve">"I'll mark these red flags on your handout."</w:t>
+            </w:r>
+          </w:p>
+          <w:p>
+            <w:pPr>
+              <w:spacing w:after="0"/>
+            </w:pPr>
+            <w:r>
+              <w:rPr>
+                <w:rFonts w:ascii="Consolas" w:cs="Consolas" w:eastAsia="Consolas" w:hAnsi="Consolas"/>
+                <w:sz w:val="19"/>
+                <w:szCs w:val="19"/>
+              </w:rPr>
+              <w:t xml:space="preserve"/>
+            </w:r>
+          </w:p>
+          <w:p>
+            <w:pPr>
+              <w:spacing w:after="0"/>
+            </w:pPr>
+            <w:r>
+              <w:rPr>
+                <w:rFonts w:ascii="Consolas" w:cs="Consolas" w:eastAsia="Consolas" w:hAnsi="Consolas"/>
+                <w:sz w:val="19"/>
+                <w:szCs w:val="19"/>
+              </w:rPr>
+              <w:t xml:space="preserve">Motion/direction: caring tone, marking the red danger-signs box on the handout on the desk. Static eye-level camera, shallow depth of field, soft natural daylight, photorealistic, 24fps.</w:t>
+            </w:r>
+          </w:p>
+          <w:p>
+            <w:pPr>
+              <w:spacing w:after="0"/>
+            </w:pPr>
+            <w:r>
+              <w:rPr>
+                <w:rFonts w:ascii="Consolas" w:cs="Consolas" w:eastAsia="Consolas" w:hAnsi="Consolas"/>
+                <w:sz w:val="19"/>
+                <w:szCs w:val="19"/>
+              </w:rPr>
+              <w:t xml:space="preserve"/>
+            </w:r>
+          </w:p>
+          <w:p>
+            <w:pPr>
+              <w:spacing w:after="0"/>
+            </w:pPr>
+            <w:r>
+              <w:rPr>
+                <w:rFonts w:ascii="Consolas" w:cs="Consolas" w:eastAsia="Consolas" w:hAnsi="Consolas"/>
+                <w:sz w:val="19"/>
+                <w:szCs w:val="19"/>
+              </w:rPr>
+              <w:t xml:space="preserve">Negative: third person, extra person, background person, the soft foreground person turning to face camera or becoming sharp, character substitution, face swap, changed hair or clothing, subtitles, captions, on-screen text, watermark, logo.</w:t>
             </w:r>
           </w:p>
         </w:tc>

</xml_diff>

<commit_message>
Remove visual-aid inserts/props: interview conversation shots only
</commit_message>
<xml_diff>
--- a/Veo3_プロンプト_肩越し_真正面寄り.docx
+++ b/Veo3_プロンプト_肩越し_真正面寄り.docx
@@ -978,7 +978,7 @@
           <w:sz w:val="21"/>
           <w:szCs w:val="21"/>
         </w:rPr>
-        <w:t xml:space="preserve">服薬指導（原文の長い1段落）は S19a→S19b→S19c→S19d の4クリップに分割し、全文をもれなく反映済み（S19b『お茶・コーヒーと一緒に飲まない…』、S19c『便が黒くなる…便秘…』も医師が実際に話す形にしました）。</w:t>
+        <w:t xml:space="preserve">服薬指導（原文の長い1段落）は S19a→S19b→S19c→S19d の4クリップに分割し、全文をもれなく反映済み。</w:t>
       </w:r>
     </w:p>
     <w:p>
@@ -991,7 +991,7 @@
           <w:sz w:val="19"/>
           <w:szCs w:val="19"/>
         </w:rPr>
-        <w:t xml:space="preserve">視覚資料は編集で重ねる：S19b（お薬スケジュール表：朝=太陽／夜=月）と S27c（ハンドアウトの赤い危険徴候欄）は、該当クリップの上にワイプ／カットインで画像を重ねると分かりやすくなります（動画自体は医師の発話ショットのままでOK）。</w:t>
+        <w:t xml:space="preserve">本編は『医師と患者の問診（会話）だけ』で構成。お薬表・ハンドアウト等の視覚資料や小道具のインサートは入れていません（全ショット、医師または患者が話す肩越しショットのみ）。台詞に出てくる『schedule／sheet／handout』は、演出上は自然な手ぶりのみで表現します。</w:t>
       </w:r>
     </w:p>
     <w:tbl>
@@ -6592,7 +6592,7 @@
                 <w:sz w:val="19"/>
                 <w:szCs w:val="19"/>
               </w:rPr>
-              <w:t xml:space="preserve">Motion/direction: calm and clear, gesturing toward the printed medication schedule on the desk. Static eye-level camera, shallow depth of field, soft natural daylight, photorealistic, 24fps.</w:t>
+              <w:t xml:space="preserve">Motion/direction: calm and clear, a small natural open-hand gesture. Static eye-level camera, shallow depth of field, soft natural daylight, photorealistic, 24fps.</w:t>
             </w:r>
           </w:p>
           <w:p>
@@ -7102,7 +7102,7 @@
                 <w:sz w:val="19"/>
                 <w:szCs w:val="19"/>
               </w:rPr>
-              <w:t xml:space="preserve">Motion/direction: small gesture toward a paper on the desk. Static eye-level camera, shallow depth of field, soft natural daylight, photorealistic, 24fps.</w:t>
+              <w:t xml:space="preserve">Motion/direction: warm, a small natural hand gesture. Static eye-level camera, shallow depth of field, soft natural daylight, photorealistic, 24fps.</w:t>
             </w:r>
           </w:p>
           <w:p>
@@ -9667,7 +9667,7 @@
                 <w:sz w:val="19"/>
                 <w:szCs w:val="19"/>
               </w:rPr>
-              <w:t xml:space="preserve">Motion/direction: caring tone, marking the red danger-signs box on the handout on the desk. Static eye-level camera, shallow depth of field, soft natural daylight, photorealistic, 24fps.</w:t>
+              <w:t xml:space="preserve">Motion/direction: caring, serious tone, a small emphasizing hand gesture. Static eye-level camera, shallow depth of field, soft natural daylight, photorealistic, 24fps.</w:t>
             </w:r>
           </w:p>
           <w:p>
@@ -10177,7 +10177,7 @@
                 <w:sz w:val="19"/>
                 <w:szCs w:val="19"/>
               </w:rPr>
-              <w:t xml:space="preserve">Motion/direction: reassuring supportive tone, gesture toward a printed note. Static eye-level camera, shallow depth of field, soft natural daylight, photorealistic, 24fps.</w:t>
+              <w:t xml:space="preserve">Motion/direction: reassuring supportive tone, calm open-hand gesture. Static eye-level camera, shallow depth of field, soft natural daylight, photorealistic, 24fps.</w:t>
             </w:r>
           </w:p>
           <w:p>
@@ -11462,7 +11462,7 @@
                 <w:sz w:val="19"/>
                 <w:szCs w:val="19"/>
               </w:rPr>
-              <w:t xml:space="preserve">Motion/direction: warm affirming, small circle-in-the-air gesture toward a sheet. Static eye-level camera, shallow depth of field, soft natural daylight, photorealistic, 24fps.</w:t>
+              <w:t xml:space="preserve">Motion/direction: warm affirming, gentle open-hand gesture. Static eye-level camera, shallow depth of field, soft natural daylight, photorealistic, 24fps.</w:t>
             </w:r>
           </w:p>
           <w:p>
@@ -11717,7 +11717,7 @@
                 <w:sz w:val="19"/>
                 <w:szCs w:val="19"/>
               </w:rPr>
-              <w:t xml:space="preserve">Motion/direction: lifting the printed pictogram schedule to show it, pointing to SUN then MOON. Static eye-level camera, shallow depth of field, soft natural daylight, photorealistic, 24fps.</w:t>
+              <w:t xml:space="preserve">Motion/direction: warm teaching tone, a natural explaining hand gesture. Static eye-level camera, shallow depth of field, soft natural daylight, photorealistic, 24fps.</w:t>
             </w:r>
           </w:p>
           <w:p>
@@ -11972,7 +11972,7 @@
                 <w:sz w:val="19"/>
                 <w:szCs w:val="19"/>
               </w:rPr>
-              <w:t xml:space="preserve">Motion/direction: pointing with his own finger to the sheet, sun then moon, small smile. Static eye-level camera, shallow depth of field, soft natural daylight, photorealistic, 24fps.</w:t>
+              <w:t xml:space="preserve">Motion/direction: a small confident nod with a natural hand gesture, small smile. Static eye-level camera, shallow depth of field, soft natural daylight, photorealistic, 24fps.</w:t>
             </w:r>
           </w:p>
           <w:p>
@@ -13213,7 +13213,7 @@
                 <w:sz w:val="19"/>
                 <w:szCs w:val="19"/>
               </w:rPr>
-              <w:t xml:space="preserve">Warm final exchange. The doctor gently passes a printed sheet toward the patient, who receives it with both hands with a small grateful nod. The doctor says, in clear calm English:</w:t>
+              <w:t xml:space="preserve">Warm final exchange. The doctor gives a warm reassuring nod; the patient nods back gratefully. The doctor says, in clear calm English:</w:t>
             </w:r>
           </w:p>
           <w:p>

</xml_diff>